<commit_message>
feat: implement dynamic event page with DOCX content rendering and styling
</commit_message>
<xml_diff>
--- a/public/events/debate-competition-argument-arena-03.docx
+++ b/public/events/debate-competition-argument-arena-03.docx
@@ -1,6 +1,6 @@
 
 <file path=word/document.xml><?xml version="1.0" encoding="utf-8"?>
-<w:document xmlns:wpc="http://schemas.microsoft.com/office/word/2010/wordprocessingCanvas" xmlns:cx="http://schemas.microsoft.com/office/drawing/2014/chartex" xmlns:cx1="http://schemas.microsoft.com/office/drawing/2015/9/8/chartex" xmlns:cx2="http://schemas.microsoft.com/office/drawing/2015/10/21/chartex" xmlns:cx3="http://schemas.microsoft.com/office/drawing/2016/5/9/chartex" xmlns:cx4="http://schemas.microsoft.com/office/drawing/2016/5/10/chartex" xmlns:cx5="http://schemas.microsoft.com/office/drawing/2016/5/11/chartex" xmlns:cx6="http://schemas.microsoft.com/office/drawing/2016/5/12/chartex" xmlns:cx7="http://schemas.microsoft.com/office/drawing/2016/5/13/chartex" xmlns:cx8="http://schemas.microsoft.com/office/drawing/2016/5/14/chartex" xmlns:mc="http://schemas.openxmlformats.org/markup-compatibility/2006" xmlns:aink="http://schemas.microsoft.com/office/drawing/2016/ink" xmlns:am3d="http://schemas.microsoft.com/office/drawing/2017/model3d" xmlns:o="urn:schemas-microsoft-com:office:office" xmlns:oel="http://schemas.microsoft.com/office/2019/extlst" xmlns:r="http://schemas.openxmlformats.org/officeDocument/2006/relationships" xmlns:m="http://schemas.openxmlformats.org/officeDocument/2006/math" xmlns:v="urn:schemas-microsoft-com:vml" xmlns:wp14="http://schemas.microsoft.com/office/word/2010/wordprocessingDrawing" xmlns:wp="http://schemas.openxmlformats.org/drawingml/2006/wordprocessingDrawing" xmlns:w10="urn:schemas-microsoft-com:office:word" xmlns:w="http://schemas.openxmlformats.org/wordprocessingml/2006/main" xmlns:w14="http://schemas.microsoft.com/office/word/2010/wordml" xmlns:w15="http://schemas.microsoft.com/office/word/2012/wordml" xmlns:w16cex="http://schemas.microsoft.com/office/word/2018/wordml/cex" xmlns:w16cid="http://schemas.microsoft.com/office/word/2016/wordml/cid" xmlns:w16="http://schemas.microsoft.com/office/word/2018/wordml" xmlns:w16du="http://schemas.microsoft.com/office/word/2023/wordml/word16du" xmlns:w16sdtdh="http://schemas.microsoft.com/office/word/2020/wordml/sdtdatahash" xmlns:w16sdtfl="http://schemas.microsoft.com/office/word/2024/wordml/sdtformatlock" xmlns:w16se="http://schemas.microsoft.com/office/word/2015/wordml/symex" xmlns:wpg="http://schemas.microsoft.com/office/word/2010/wordprocessingGroup" xmlns:wpi="http://schemas.microsoft.com/office/word/2010/wordprocessingInk" xmlns:wne="http://schemas.microsoft.com/office/word/2006/wordml" xmlns:wps="http://schemas.microsoft.com/office/word/2010/wordprocessingShape" mc:Ignorable="w14 w15 w16se w16cid w16 w16cex w16sdtdh w16sdtfl w16du wp14">
+<w:document xmlns:wpc="http://schemas.microsoft.com/office/word/2010/wordprocessingCanvas" xmlns:cx="http://schemas.microsoft.com/office/drawing/2014/chartex" xmlns:cx1="http://schemas.microsoft.com/office/drawing/2015/9/8/chartex" xmlns:cx2="http://schemas.microsoft.com/office/drawing/2015/10/21/chartex" xmlns:cx3="http://schemas.microsoft.com/office/drawing/2016/5/9/chartex" xmlns:cx4="http://schemas.microsoft.com/office/drawing/2016/5/10/chartex" xmlns:cx5="http://schemas.microsoft.com/office/drawing/2016/5/11/chartex" xmlns:cx6="http://schemas.microsoft.com/office/drawing/2016/5/12/chartex" xmlns:cx7="http://schemas.microsoft.com/office/drawing/2016/5/13/chartex" xmlns:cx8="http://schemas.microsoft.com/office/drawing/2016/5/14/chartex" xmlns:mc="http://schemas.openxmlformats.org/markup-compatibility/2006" xmlns:aink="http://schemas.microsoft.com/office/drawing/2016/ink" xmlns:am3d="http://schemas.microsoft.com/office/drawing/2017/model3d" xmlns:o="urn:schemas-microsoft-com:office:office" xmlns:oel="http://schemas.microsoft.com/office/2019/extlst" xmlns:r="http://schemas.openxmlformats.org/officeDocument/2006/relationships" xmlns:m="http://schemas.openxmlformats.org/officeDocument/2006/math" xmlns:v="urn:schemas-microsoft-com:vml" xmlns:wp14="http://schemas.microsoft.com/office/word/2010/wordprocessingDrawing" xmlns:wp="http://schemas.openxmlformats.org/drawingml/2006/wordprocessingDrawing" xmlns:w10="urn:schemas-microsoft-com:office:word" xmlns:w="http://schemas.openxmlformats.org/wordprocessingml/2006/main" xmlns:w14="http://schemas.microsoft.com/office/word/2010/wordml" xmlns:w15="http://schemas.microsoft.com/office/word/2012/wordml" xmlns:w16cei="http://schemas.microsoft.com/office/word/2026/wordml/cei" xmlns:w16cex="http://schemas.microsoft.com/office/word/2018/wordml/cex" xmlns:w16cid="http://schemas.microsoft.com/office/word/2016/wordml/cid" xmlns:w16="http://schemas.microsoft.com/office/word/2018/wordml" xmlns:w16du="http://schemas.microsoft.com/office/word/2023/wordml/word16du" xmlns:w16sdtdh="http://schemas.microsoft.com/office/word/2020/wordml/sdtdatahash" xmlns:w16sdtfl="http://schemas.microsoft.com/office/word/2024/wordml/sdtformatlock" xmlns:w16se="http://schemas.microsoft.com/office/word/2015/wordml/symex" xmlns:wpg="http://schemas.microsoft.com/office/word/2010/wordprocessingGroup" xmlns:wpi="http://schemas.microsoft.com/office/word/2010/wordprocessingInk" xmlns:wne="http://schemas.microsoft.com/office/word/2006/wordml" xmlns:wps="http://schemas.microsoft.com/office/word/2010/wordprocessingShape" mc:Ignorable="w14 w15 w16se w16cid w16 w16cex w16sdtdh w16sdtfl w16du wp14">
   <w:body>
     <w:p>
       <w:pPr>
@@ -32,20 +32,16 @@
         </w:rPr>
         <w:t>Event :</w:t>
       </w:r>
-      <w:r>
-        <w:rPr>
-          <w:b/>
-          <w:bCs/>
-        </w:rPr>
-        <w:t>Argument</w:t>
-      </w:r>
       <w:proofErr w:type="gramEnd"/>
       <w:r>
         <w:rPr>
           <w:b/>
           <w:bCs/>
         </w:rPr>
-        <w:t xml:space="preserve"> Arena</w:t>
+        <w:t xml:space="preserve"> </w:t>
+      </w:r>
+      <w:r>
+        <w:t>Argument Arena</w:t>
       </w:r>
     </w:p>
     <w:p>
@@ -79,18 +75,10 @@
         <w:t>) :</w:t>
       </w:r>
       <w:r>
-        <w:rPr>
-          <w:b/>
-          <w:bCs/>
-        </w:rPr>
         <w:t>On</w:t>
       </w:r>
       <w:proofErr w:type="gramEnd"/>
       <w:r>
-        <w:rPr>
-          <w:b/>
-          <w:bCs/>
-        </w:rPr>
         <w:t xml:space="preserve"> Stage</w:t>
       </w:r>
     </w:p>
@@ -121,6 +109,9 @@
           <w:b/>
           <w:bCs/>
         </w:rPr>
+        <w:t xml:space="preserve"> </w:t>
+      </w:r>
+      <w:r>
         <w:t>2(Per Team)</w:t>
       </w:r>
     </w:p>
@@ -147,10 +138,6 @@
         <w:t>Number of Rounds :</w:t>
       </w:r>
       <w:r>
-        <w:rPr>
-          <w:b/>
-          <w:bCs/>
-        </w:rPr>
         <w:t>3</w:t>
       </w:r>
     </w:p>
@@ -174,34 +161,17 @@
           <w:b/>
           <w:bCs/>
         </w:rPr>
-        <w:t xml:space="preserve">Rules and Regulations (For each </w:t>
-      </w:r>
-      <w:proofErr w:type="spellStart"/>
+        <w:t xml:space="preserve">Rules and </w:t>
+      </w:r>
       <w:proofErr w:type="gramStart"/>
       <w:r>
         <w:rPr>
           <w:b/>
           <w:bCs/>
         </w:rPr>
-        <w:t>round;if</w:t>
-      </w:r>
-      <w:proofErr w:type="spellEnd"/>
+        <w:t>Regulations :</w:t>
+      </w:r>
       <w:proofErr w:type="gramEnd"/>
-      <w:r>
-        <w:rPr>
-          <w:b/>
-          <w:bCs/>
-        </w:rPr>
-        <w:t xml:space="preserve"> exists) / Guidelines:</w:t>
-      </w:r>
-    </w:p>
-    <w:p>
-      <w:pPr>
-        <w:rPr>
-          <w:b/>
-          <w:bCs/>
-        </w:rPr>
-      </w:pPr>
     </w:p>
     <w:p>
       <w:pPr>
@@ -989,21 +959,38 @@
       </w:pPr>
     </w:p>
     <w:p>
+      <w:pPr>
+        <w:rPr>
+          <w:b/>
+          <w:bCs/>
+        </w:rPr>
+      </w:pPr>
+    </w:p>
+    <w:p>
       <w:r>
         <w:rPr>
           <w:b/>
           <w:bCs/>
         </w:rPr>
         <w:lastRenderedPageBreak/>
-        <w:t>Name of the Faculty Coordinator</w:t>
-      </w:r>
-      <w:r>
-        <w:rPr>
-          <w:b/>
-          <w:bCs/>
-        </w:rPr>
-        <w:t>-</w:t>
-      </w:r>
+        <w:t xml:space="preserve">Name of the Faculty </w:t>
+      </w:r>
+      <w:proofErr w:type="gramStart"/>
+      <w:r>
+        <w:rPr>
+          <w:b/>
+          <w:bCs/>
+        </w:rPr>
+        <w:t>Coordinator</w:t>
+      </w:r>
+      <w:r>
+        <w:rPr>
+          <w:b/>
+          <w:bCs/>
+        </w:rPr>
+        <w:t xml:space="preserve"> :</w:t>
+      </w:r>
+      <w:proofErr w:type="gramEnd"/>
       <w:r>
         <w:rPr>
           <w:b/>
@@ -1012,53 +999,20 @@
         <w:t xml:space="preserve"> </w:t>
       </w:r>
       <w:r>
-        <w:rPr>
-          <w:b/>
-          <w:bCs/>
-        </w:rPr>
-        <w:t>M</w:t>
-      </w:r>
-      <w:r>
-        <w:rPr>
-          <w:b/>
-          <w:bCs/>
-        </w:rPr>
-        <w:t>s</w:t>
-      </w:r>
-      <w:r>
-        <w:rPr>
-          <w:b/>
-          <w:bCs/>
-        </w:rPr>
-        <w:t xml:space="preserve">. </w:t>
-      </w:r>
-      <w:r>
-        <w:rPr>
-          <w:b/>
-          <w:bCs/>
-        </w:rPr>
-        <w:t>Sneha Prabhudessai</w:t>
-      </w:r>
-      <w:r>
-        <w:rPr>
-          <w:b/>
-          <w:bCs/>
-        </w:rPr>
-        <w:t xml:space="preserve">                                                                                                          </w:t>
-      </w:r>
-      <w:r>
-        <w:rPr>
-          <w:b/>
-          <w:bCs/>
-        </w:rPr>
+        <w:t xml:space="preserve">Ms. Sneha Prabhudessai                                                                                                          </w:t>
+      </w:r>
+      <w:r>
         <w:t xml:space="preserve">                                               </w:t>
       </w:r>
       <w:r>
-        <w:rPr>
-          <w:b/>
-          <w:bCs/>
-        </w:rPr>
-        <w:t xml:space="preserve">                                                                                                            E</w:t>
+        <w:t xml:space="preserve">                                                                                                            </w:t>
+      </w:r>
+      <w:r>
+        <w:rPr>
+          <w:b/>
+          <w:bCs/>
+        </w:rPr>
+        <w:t>E</w:t>
       </w:r>
       <w:r>
         <w:rPr>
@@ -1072,7 +1026,7 @@
           <w:b/>
           <w:bCs/>
         </w:rPr>
-        <w:t>-</w:t>
+        <w:t xml:space="preserve"> :</w:t>
       </w:r>
       <w:r>
         <w:t xml:space="preserve"> </w:t>
@@ -1106,38 +1060,66 @@
           <w:b/>
           <w:bCs/>
         </w:rPr>
-        <w:t>Name of the Student</w:t>
-      </w:r>
-      <w:r>
-        <w:rPr>
-          <w:b/>
-          <w:bCs/>
-        </w:rPr>
-        <w:t xml:space="preserve"> Coordinator-Muaz Pathan</w:t>
-      </w:r>
-    </w:p>
-    <w:p>
-      <w:pPr>
-        <w:rPr>
-          <w:b/>
-          <w:bCs/>
-        </w:rPr>
-      </w:pPr>
-      <w:r>
-        <w:rPr>
-          <w:b/>
-          <w:bCs/>
-        </w:rPr>
-        <w:t>Phone No-9767702818</w:t>
-      </w:r>
-    </w:p>
-    <w:p>
-      <w:pPr>
-        <w:rPr>
-          <w:b/>
-          <w:bCs/>
-        </w:rPr>
-      </w:pPr>
+        <w:t xml:space="preserve">Name of the Student </w:t>
+      </w:r>
+      <w:proofErr w:type="gramStart"/>
+      <w:r>
+        <w:rPr>
+          <w:b/>
+          <w:bCs/>
+        </w:rPr>
+        <w:t>Coordinator</w:t>
+      </w:r>
+      <w:r>
+        <w:rPr>
+          <w:b/>
+          <w:bCs/>
+        </w:rPr>
+        <w:t xml:space="preserve"> :</w:t>
+      </w:r>
+      <w:r>
+        <w:t>Muaz</w:t>
+      </w:r>
+      <w:proofErr w:type="gramEnd"/>
+      <w:r>
+        <w:t xml:space="preserve"> Pathan</w:t>
+      </w:r>
+    </w:p>
+    <w:p>
+      <w:r>
+        <w:rPr>
+          <w:b/>
+          <w:bCs/>
+        </w:rPr>
+        <w:t xml:space="preserve">Phone </w:t>
+      </w:r>
+      <w:proofErr w:type="gramStart"/>
+      <w:r>
+        <w:rPr>
+          <w:b/>
+          <w:bCs/>
+        </w:rPr>
+        <w:t>No</w:t>
+      </w:r>
+      <w:r>
+        <w:rPr>
+          <w:b/>
+          <w:bCs/>
+        </w:rPr>
+        <w:t xml:space="preserve"> </w:t>
+      </w:r>
+      <w:r>
+        <w:t>:</w:t>
+      </w:r>
+      <w:proofErr w:type="gramEnd"/>
+      <w:r>
+        <w:t xml:space="preserve"> </w:t>
+      </w:r>
+      <w:r>
+        <w:t>9767702818</w:t>
+      </w:r>
+    </w:p>
+    <w:p>
       <w:r>
         <w:rPr>
           <w:b/>
@@ -1145,19 +1127,33 @@
         </w:rPr>
         <w:t xml:space="preserve">Email </w:t>
       </w:r>
-      <w:r>
-        <w:rPr>
-          <w:b/>
-          <w:bCs/>
-        </w:rPr>
-        <w:t xml:space="preserve">Id- </w:t>
+      <w:proofErr w:type="gramStart"/>
+      <w:r>
+        <w:rPr>
+          <w:b/>
+          <w:bCs/>
+        </w:rPr>
+        <w:t>Id</w:t>
+      </w:r>
+      <w:r>
+        <w:rPr>
+          <w:b/>
+          <w:bCs/>
+        </w:rPr>
+        <w:t xml:space="preserve"> :</w:t>
+      </w:r>
+      <w:proofErr w:type="gramEnd"/>
+      <w:r>
+        <w:rPr>
+          <w:b/>
+          <w:bCs/>
+        </w:rPr>
+        <w:t xml:space="preserve"> </w:t>
       </w:r>
       <w:hyperlink r:id="rId7" w:history="1">
         <w:r>
           <w:rPr>
             <w:rStyle w:val="Hyperlink"/>
-            <w:b/>
-            <w:bCs/>
           </w:rPr>
           <w:t>2408059.muaz.sdcce@vvm.edu.in</w:t>
         </w:r>
@@ -1178,43 +1174,69 @@
           <w:bCs/>
         </w:rPr>
       </w:pPr>
-      <w:r>
-        <w:rPr>
-          <w:b/>
-          <w:bCs/>
-        </w:rPr>
-        <w:t>Name-Sumit Sawant</w:t>
-      </w:r>
-    </w:p>
-    <w:p>
-      <w:pPr>
-        <w:rPr>
-          <w:b/>
-          <w:bCs/>
-        </w:rPr>
-      </w:pPr>
-      <w:r>
-        <w:rPr>
-          <w:b/>
-          <w:bCs/>
-        </w:rPr>
-        <w:t>Phone No-</w:t>
-      </w:r>
-      <w:r>
-        <w:rPr>
-          <w:b/>
-          <w:bCs/>
-        </w:rPr>
+      <w:proofErr w:type="gramStart"/>
+      <w:r>
+        <w:rPr>
+          <w:b/>
+          <w:bCs/>
+        </w:rPr>
+        <w:t>Name</w:t>
+      </w:r>
+      <w:r>
+        <w:rPr>
+          <w:b/>
+          <w:bCs/>
+        </w:rPr>
+        <w:t xml:space="preserve"> :</w:t>
+      </w:r>
+      <w:proofErr w:type="gramEnd"/>
+      <w:r>
+        <w:rPr>
+          <w:b/>
+          <w:bCs/>
+        </w:rPr>
+        <w:t xml:space="preserve"> </w:t>
+      </w:r>
+      <w:r>
+        <w:t>Sumit Sawant</w:t>
+      </w:r>
+    </w:p>
+    <w:p>
+      <w:r>
+        <w:rPr>
+          <w:b/>
+          <w:bCs/>
+        </w:rPr>
+        <w:t xml:space="preserve">Phone </w:t>
+      </w:r>
+      <w:proofErr w:type="gramStart"/>
+      <w:r>
+        <w:rPr>
+          <w:b/>
+          <w:bCs/>
+        </w:rPr>
+        <w:t>No</w:t>
+      </w:r>
+      <w:r>
+        <w:rPr>
+          <w:b/>
+          <w:bCs/>
+        </w:rPr>
+        <w:t xml:space="preserve"> :</w:t>
+      </w:r>
+      <w:proofErr w:type="gramEnd"/>
+      <w:r>
+        <w:rPr>
+          <w:b/>
+          <w:bCs/>
+        </w:rPr>
+        <w:t xml:space="preserve"> </w:t>
+      </w:r>
+      <w:r>
         <w:t>9359391148</w:t>
       </w:r>
     </w:p>
     <w:p>
-      <w:pPr>
-        <w:rPr>
-          <w:b/>
-          <w:bCs/>
-        </w:rPr>
-      </w:pPr>
       <w:r>
         <w:rPr>
           <w:b/>
@@ -1226,42 +1248,8 @@
         <w:r>
           <w:rPr>
             <w:rStyle w:val="Hyperlink"/>
-            <w:b/>
-            <w:bCs/>
           </w:rPr>
-          <w:t>240</w:t>
-        </w:r>
-        <w:r>
-          <w:rPr>
-            <w:rStyle w:val="Hyperlink"/>
-            <w:b/>
-            <w:bCs/>
-          </w:rPr>
-          <w:t>11021</w:t>
-        </w:r>
-        <w:r>
-          <w:rPr>
-            <w:rStyle w:val="Hyperlink"/>
-            <w:b/>
-            <w:bCs/>
-          </w:rPr>
-          <w:t>.</w:t>
-        </w:r>
-        <w:r>
-          <w:rPr>
-            <w:rStyle w:val="Hyperlink"/>
-            <w:b/>
-            <w:bCs/>
-          </w:rPr>
-          <w:t>sumit</w:t>
-        </w:r>
-        <w:r>
-          <w:rPr>
-            <w:rStyle w:val="Hyperlink"/>
-            <w:b/>
-            <w:bCs/>
-          </w:rPr>
-          <w:t>.sdcce@vvm.edu.in</w:t>
+          <w:t>24011021.sumit.sdcce@vvm.edu.in</w:t>
         </w:r>
       </w:hyperlink>
     </w:p>
@@ -1375,7 +1363,7 @@
 </file>
 
 <file path=word/numbering.xml><?xml version="1.0" encoding="utf-8"?>
-<w:numbering xmlns:wpc="http://schemas.microsoft.com/office/word/2010/wordprocessingCanvas" xmlns:cx="http://schemas.microsoft.com/office/drawing/2014/chartex" xmlns:cx1="http://schemas.microsoft.com/office/drawing/2015/9/8/chartex" xmlns:cx2="http://schemas.microsoft.com/office/drawing/2015/10/21/chartex" xmlns:cx3="http://schemas.microsoft.com/office/drawing/2016/5/9/chartex" xmlns:cx4="http://schemas.microsoft.com/office/drawing/2016/5/10/chartex" xmlns:cx5="http://schemas.microsoft.com/office/drawing/2016/5/11/chartex" xmlns:cx6="http://schemas.microsoft.com/office/drawing/2016/5/12/chartex" xmlns:cx7="http://schemas.microsoft.com/office/drawing/2016/5/13/chartex" xmlns:cx8="http://schemas.microsoft.com/office/drawing/2016/5/14/chartex" xmlns:mc="http://schemas.openxmlformats.org/markup-compatibility/2006" xmlns:aink="http://schemas.microsoft.com/office/drawing/2016/ink" xmlns:am3d="http://schemas.microsoft.com/office/drawing/2017/model3d" xmlns:o="urn:schemas-microsoft-com:office:office" xmlns:oel="http://schemas.microsoft.com/office/2019/extlst" xmlns:r="http://schemas.openxmlformats.org/officeDocument/2006/relationships" xmlns:m="http://schemas.openxmlformats.org/officeDocument/2006/math" xmlns:v="urn:schemas-microsoft-com:vml" xmlns:wp14="http://schemas.microsoft.com/office/word/2010/wordprocessingDrawing" xmlns:wp="http://schemas.openxmlformats.org/drawingml/2006/wordprocessingDrawing" xmlns:w10="urn:schemas-microsoft-com:office:word" xmlns:w="http://schemas.openxmlformats.org/wordprocessingml/2006/main" xmlns:w14="http://schemas.microsoft.com/office/word/2010/wordml" xmlns:w15="http://schemas.microsoft.com/office/word/2012/wordml" xmlns:w16cex="http://schemas.microsoft.com/office/word/2018/wordml/cex" xmlns:w16cid="http://schemas.microsoft.com/office/word/2016/wordml/cid" xmlns:w16="http://schemas.microsoft.com/office/word/2018/wordml" xmlns:w16du="http://schemas.microsoft.com/office/word/2023/wordml/word16du" xmlns:w16sdtdh="http://schemas.microsoft.com/office/word/2020/wordml/sdtdatahash" xmlns:w16sdtfl="http://schemas.microsoft.com/office/word/2024/wordml/sdtformatlock" xmlns:w16se="http://schemas.microsoft.com/office/word/2015/wordml/symex" xmlns:wpg="http://schemas.microsoft.com/office/word/2010/wordprocessingGroup" xmlns:wpi="http://schemas.microsoft.com/office/word/2010/wordprocessingInk" xmlns:wne="http://schemas.microsoft.com/office/word/2006/wordml" xmlns:wps="http://schemas.microsoft.com/office/word/2010/wordprocessingShape" mc:Ignorable="w14 w15 w16se w16cid w16 w16cex w16sdtdh w16sdtfl w16du wp14">
+<w:numbering xmlns:wpc="http://schemas.microsoft.com/office/word/2010/wordprocessingCanvas" xmlns:cx="http://schemas.microsoft.com/office/drawing/2014/chartex" xmlns:cx1="http://schemas.microsoft.com/office/drawing/2015/9/8/chartex" xmlns:cx2="http://schemas.microsoft.com/office/drawing/2015/10/21/chartex" xmlns:cx3="http://schemas.microsoft.com/office/drawing/2016/5/9/chartex" xmlns:cx4="http://schemas.microsoft.com/office/drawing/2016/5/10/chartex" xmlns:cx5="http://schemas.microsoft.com/office/drawing/2016/5/11/chartex" xmlns:cx6="http://schemas.microsoft.com/office/drawing/2016/5/12/chartex" xmlns:cx7="http://schemas.microsoft.com/office/drawing/2016/5/13/chartex" xmlns:cx8="http://schemas.microsoft.com/office/drawing/2016/5/14/chartex" xmlns:mc="http://schemas.openxmlformats.org/markup-compatibility/2006" xmlns:aink="http://schemas.microsoft.com/office/drawing/2016/ink" xmlns:am3d="http://schemas.microsoft.com/office/drawing/2017/model3d" xmlns:o="urn:schemas-microsoft-com:office:office" xmlns:oel="http://schemas.microsoft.com/office/2019/extlst" xmlns:r="http://schemas.openxmlformats.org/officeDocument/2006/relationships" xmlns:m="http://schemas.openxmlformats.org/officeDocument/2006/math" xmlns:v="urn:schemas-microsoft-com:vml" xmlns:wp14="http://schemas.microsoft.com/office/word/2010/wordprocessingDrawing" xmlns:wp="http://schemas.openxmlformats.org/drawingml/2006/wordprocessingDrawing" xmlns:w10="urn:schemas-microsoft-com:office:word" xmlns:w="http://schemas.openxmlformats.org/wordprocessingml/2006/main" xmlns:w14="http://schemas.microsoft.com/office/word/2010/wordml" xmlns:w15="http://schemas.microsoft.com/office/word/2012/wordml" xmlns:w16cei="http://schemas.microsoft.com/office/word/2026/wordml/cei" xmlns:w16cex="http://schemas.microsoft.com/office/word/2018/wordml/cex" xmlns:w16cid="http://schemas.microsoft.com/office/word/2016/wordml/cid" xmlns:w16="http://schemas.microsoft.com/office/word/2018/wordml" xmlns:w16du="http://schemas.microsoft.com/office/word/2023/wordml/word16du" xmlns:w16sdtdh="http://schemas.microsoft.com/office/word/2020/wordml/sdtdatahash" xmlns:w16sdtfl="http://schemas.microsoft.com/office/word/2024/wordml/sdtformatlock" xmlns:w16se="http://schemas.microsoft.com/office/word/2015/wordml/symex" xmlns:wpg="http://schemas.microsoft.com/office/word/2010/wordprocessingGroup" xmlns:wpi="http://schemas.microsoft.com/office/word/2010/wordprocessingInk" xmlns:wne="http://schemas.microsoft.com/office/word/2006/wordml" xmlns:wps="http://schemas.microsoft.com/office/word/2010/wordprocessingShape" mc:Ignorable="w14 w15 w16se w16cid w16 w16cex w16sdtdh w16sdtfl w16du wp14">
   <w:abstractNum w:abstractNumId="0" w15:restartNumberingAfterBreak="0">
     <w:nsid w:val="0683733D"/>
     <w:multiLevelType w:val="multilevel"/>

</xml_diff>